<commit_message>
agrego actividad 4 en html
</commit_message>
<xml_diff>
--- a/recursos/docs/Actividad 04.docx
+++ b/recursos/docs/Actividad 04.docx
@@ -446,7 +446,7 @@
           <w:r>
             <w:fldChar w:fldCharType="separate"/>
           </w:r>
-          <w:hyperlink w:anchor="_Toc239020404" w:history="1">
+          <w:hyperlink w:anchor="_Toc239025970" w:history="1">
             <w:r>
               <w:rPr>
                 <w:rStyle w:val="Hipervnculo"/>
@@ -473,7 +473,7 @@
                 <w:noProof/>
                 <w:webHidden/>
               </w:rPr>
-              <w:instrText xml:space="preserve"> PAGEREF _Toc239020404 \h </w:instrText>
+              <w:instrText xml:space="preserve"> PAGEREF _Toc239025970 \h </w:instrText>
             </w:r>
             <w:r>
               <w:rPr>
@@ -518,7 +518,7 @@
               <w:lang w:eastAsia="es-MX"/>
             </w:rPr>
           </w:pPr>
-          <w:hyperlink w:anchor="_Toc239020405" w:history="1">
+          <w:hyperlink w:anchor="_Toc239025971" w:history="1">
             <w:r>
               <w:rPr>
                 <w:rStyle w:val="Hipervnculo"/>
@@ -545,7 +545,7 @@
                 <w:noProof/>
                 <w:webHidden/>
               </w:rPr>
-              <w:instrText xml:space="preserve"> PAGEREF _Toc239020405 \h </w:instrText>
+              <w:instrText xml:space="preserve"> PAGEREF _Toc239025971 \h </w:instrText>
             </w:r>
             <w:r>
               <w:rPr>
@@ -590,7 +590,7 @@
               <w:lang w:eastAsia="es-MX"/>
             </w:rPr>
           </w:pPr>
-          <w:hyperlink w:anchor="_Toc239020406" w:history="1">
+          <w:hyperlink w:anchor="_Toc239025972" w:history="1">
             <w:r>
               <w:rPr>
                 <w:rStyle w:val="Hipervnculo"/>
@@ -617,7 +617,7 @@
                 <w:noProof/>
                 <w:webHidden/>
               </w:rPr>
-              <w:instrText xml:space="preserve"> PAGEREF _Toc239020406 \h </w:instrText>
+              <w:instrText xml:space="preserve"> PAGEREF _Toc239025972 \h </w:instrText>
             </w:r>
             <w:r>
               <w:rPr>
@@ -662,7 +662,7 @@
               <w:lang w:eastAsia="es-MX"/>
             </w:rPr>
           </w:pPr>
-          <w:hyperlink w:anchor="_Toc239020407" w:history="1">
+          <w:hyperlink w:anchor="_Toc239025973" w:history="1">
             <w:r>
               <w:rPr>
                 <w:rStyle w:val="Hipervnculo"/>
@@ -689,7 +689,7 @@
                 <w:noProof/>
                 <w:webHidden/>
               </w:rPr>
-              <w:instrText xml:space="preserve"> PAGEREF _Toc239020407 \h </w:instrText>
+              <w:instrText xml:space="preserve"> PAGEREF _Toc239025973 \h </w:instrText>
             </w:r>
             <w:r>
               <w:rPr>
@@ -734,7 +734,7 @@
               <w:lang w:eastAsia="es-MX"/>
             </w:rPr>
           </w:pPr>
-          <w:hyperlink w:anchor="_Toc239020408" w:history="1">
+          <w:hyperlink w:anchor="_Toc239025974" w:history="1">
             <w:r>
               <w:rPr>
                 <w:rStyle w:val="Hipervnculo"/>
@@ -761,7 +761,7 @@
                 <w:noProof/>
                 <w:webHidden/>
               </w:rPr>
-              <w:instrText xml:space="preserve"> PAGEREF _Toc239020408 \h </w:instrText>
+              <w:instrText xml:space="preserve"> PAGEREF _Toc239025974 \h </w:instrText>
             </w:r>
             <w:r>
               <w:rPr>
@@ -806,7 +806,7 @@
               <w:lang w:eastAsia="es-MX"/>
             </w:rPr>
           </w:pPr>
-          <w:hyperlink w:anchor="_Toc239020409" w:history="1">
+          <w:hyperlink w:anchor="_Toc239025975" w:history="1">
             <w:r>
               <w:rPr>
                 <w:rStyle w:val="Hipervnculo"/>
@@ -833,7 +833,7 @@
                 <w:noProof/>
                 <w:webHidden/>
               </w:rPr>
-              <w:instrText xml:space="preserve"> PAGEREF _Toc239020409 \h </w:instrText>
+              <w:instrText xml:space="preserve"> PAGEREF _Toc239025975 \h </w:instrText>
             </w:r>
             <w:r>
               <w:rPr>
@@ -878,7 +878,7 @@
               <w:lang w:eastAsia="es-MX"/>
             </w:rPr>
           </w:pPr>
-          <w:hyperlink w:anchor="_Toc239020410" w:history="1">
+          <w:hyperlink w:anchor="_Toc239025976" w:history="1">
             <w:r>
               <w:rPr>
                 <w:rStyle w:val="Hipervnculo"/>
@@ -905,7 +905,7 @@
                 <w:noProof/>
                 <w:webHidden/>
               </w:rPr>
-              <w:instrText xml:space="preserve"> PAGEREF _Toc239020410 \h </w:instrText>
+              <w:instrText xml:space="preserve"> PAGEREF _Toc239025976 \h </w:instrText>
             </w:r>
             <w:r>
               <w:rPr>
@@ -926,6 +926,78 @@
                 <w:webHidden/>
               </w:rPr>
               <w:t>4</w:t>
+            </w:r>
+            <w:r>
+              <w:rPr>
+                <w:noProof/>
+                <w:webHidden/>
+              </w:rPr>
+              <w:fldChar w:fldCharType="end"/>
+            </w:r>
+          </w:hyperlink>
+        </w:p>
+        <w:p>
+          <w:pPr>
+            <w:pStyle w:val="TDC3"/>
+            <w:tabs>
+              <w:tab w:val="right" w:leader="dot" w:pos="9350"/>
+            </w:tabs>
+            <w:rPr>
+              <w:rFonts w:eastAsiaTheme="minorEastAsia"/>
+              <w:noProof/>
+              <w:sz w:val="24"/>
+              <w:szCs w:val="24"/>
+              <w:lang w:eastAsia="es-MX"/>
+            </w:rPr>
+          </w:pPr>
+          <w:hyperlink w:anchor="_Toc239025977" w:history="1">
+            <w:r>
+              <w:rPr>
+                <w:rStyle w:val="Hipervnculo"/>
+                <w:noProof/>
+              </w:rPr>
+              <w:t>¿Qué es un Credential Harvester y cuál es su función dentro de una campaña de phishing?</w:t>
+            </w:r>
+            <w:r>
+              <w:rPr>
+                <w:noProof/>
+                <w:webHidden/>
+              </w:rPr>
+              <w:tab/>
+            </w:r>
+            <w:r>
+              <w:rPr>
+                <w:noProof/>
+                <w:webHidden/>
+              </w:rPr>
+              <w:fldChar w:fldCharType="begin"/>
+            </w:r>
+            <w:r>
+              <w:rPr>
+                <w:noProof/>
+                <w:webHidden/>
+              </w:rPr>
+              <w:instrText xml:space="preserve"> PAGEREF _Toc239025977 \h </w:instrText>
+            </w:r>
+            <w:r>
+              <w:rPr>
+                <w:noProof/>
+                <w:webHidden/>
+              </w:rPr>
+            </w:r>
+            <w:r>
+              <w:rPr>
+                <w:noProof/>
+                <w:webHidden/>
+              </w:rPr>
+              <w:fldChar w:fldCharType="separate"/>
+            </w:r>
+            <w:r>
+              <w:rPr>
+                <w:noProof/>
+                <w:webHidden/>
+              </w:rPr>
+              <w:t>5</w:t>
             </w:r>
             <w:r>
               <w:rPr>
@@ -950,7 +1022,7 @@
               <w:lang w:eastAsia="es-MX"/>
             </w:rPr>
           </w:pPr>
-          <w:hyperlink w:anchor="_Toc239020411" w:history="1">
+          <w:hyperlink w:anchor="_Toc239025978" w:history="1">
             <w:r>
               <w:rPr>
                 <w:rStyle w:val="Hipervnculo"/>
@@ -977,7 +1049,7 @@
                 <w:noProof/>
                 <w:webHidden/>
               </w:rPr>
-              <w:instrText xml:space="preserve"> PAGEREF _Toc239020411 \h </w:instrText>
+              <w:instrText xml:space="preserve"> PAGEREF _Toc239025978 \h </w:instrText>
             </w:r>
             <w:r>
               <w:rPr>
@@ -997,7 +1069,7 @@
                 <w:noProof/>
                 <w:webHidden/>
               </w:rPr>
-              <w:t>7</w:t>
+              <w:t>8</w:t>
             </w:r>
             <w:r>
               <w:rPr>
@@ -1022,7 +1094,7 @@
               <w:lang w:eastAsia="es-MX"/>
             </w:rPr>
           </w:pPr>
-          <w:hyperlink w:anchor="_Toc239020412" w:history="1">
+          <w:hyperlink w:anchor="_Toc239025979" w:history="1">
             <w:r>
               <w:rPr>
                 <w:rStyle w:val="Hipervnculo"/>
@@ -1049,7 +1121,7 @@
                 <w:noProof/>
                 <w:webHidden/>
               </w:rPr>
-              <w:instrText xml:space="preserve"> PAGEREF _Toc239020412 \h </w:instrText>
+              <w:instrText xml:space="preserve"> PAGEREF _Toc239025979 \h </w:instrText>
             </w:r>
             <w:r>
               <w:rPr>
@@ -1069,7 +1141,7 @@
                 <w:noProof/>
                 <w:webHidden/>
               </w:rPr>
-              <w:t>8</w:t>
+              <w:t>9</w:t>
             </w:r>
             <w:r>
               <w:rPr>
@@ -1094,7 +1166,7 @@
               <w:lang w:eastAsia="es-MX"/>
             </w:rPr>
           </w:pPr>
-          <w:hyperlink w:anchor="_Toc239020413" w:history="1">
+          <w:hyperlink w:anchor="_Toc239025980" w:history="1">
             <w:r>
               <w:rPr>
                 <w:rStyle w:val="Hipervnculo"/>
@@ -1121,7 +1193,7 @@
                 <w:noProof/>
                 <w:webHidden/>
               </w:rPr>
-              <w:instrText xml:space="preserve"> PAGEREF _Toc239020413 \h </w:instrText>
+              <w:instrText xml:space="preserve"> PAGEREF _Toc239025980 \h </w:instrText>
             </w:r>
             <w:r>
               <w:rPr>
@@ -1166,7 +1238,7 @@
               <w:lang w:eastAsia="es-MX"/>
             </w:rPr>
           </w:pPr>
-          <w:hyperlink w:anchor="_Toc239020414" w:history="1">
+          <w:hyperlink w:anchor="_Toc239025981" w:history="1">
             <w:r>
               <w:rPr>
                 <w:rStyle w:val="Hipervnculo"/>
@@ -1193,7 +1265,7 @@
                 <w:noProof/>
                 <w:webHidden/>
               </w:rPr>
-              <w:instrText xml:space="preserve"> PAGEREF _Toc239020414 \h </w:instrText>
+              <w:instrText xml:space="preserve"> PAGEREF _Toc239025981 \h </w:instrText>
             </w:r>
             <w:r>
               <w:rPr>
@@ -1213,7 +1285,7 @@
                 <w:noProof/>
                 <w:webHidden/>
               </w:rPr>
-              <w:t>9</w:t>
+              <w:t>10</w:t>
             </w:r>
             <w:r>
               <w:rPr>
@@ -1238,7 +1310,7 @@
               <w:lang w:eastAsia="es-MX"/>
             </w:rPr>
           </w:pPr>
-          <w:hyperlink w:anchor="_Toc239020415" w:history="1">
+          <w:hyperlink w:anchor="_Toc239025982" w:history="1">
             <w:r>
               <w:rPr>
                 <w:rStyle w:val="Hipervnculo"/>
@@ -1265,7 +1337,7 @@
                 <w:noProof/>
                 <w:webHidden/>
               </w:rPr>
-              <w:instrText xml:space="preserve"> PAGEREF _Toc239020415 \h </w:instrText>
+              <w:instrText xml:space="preserve"> PAGEREF _Toc239025982 \h </w:instrText>
             </w:r>
             <w:r>
               <w:rPr>
@@ -1285,7 +1357,7 @@
                 <w:noProof/>
                 <w:webHidden/>
               </w:rPr>
-              <w:t>9</w:t>
+              <w:t>10</w:t>
             </w:r>
             <w:r>
               <w:rPr>
@@ -1310,7 +1382,7 @@
               <w:lang w:eastAsia="es-MX"/>
             </w:rPr>
           </w:pPr>
-          <w:hyperlink w:anchor="_Toc239020416" w:history="1">
+          <w:hyperlink w:anchor="_Toc239025983" w:history="1">
             <w:r>
               <w:rPr>
                 <w:rStyle w:val="Hipervnculo"/>
@@ -1337,7 +1409,7 @@
                 <w:noProof/>
                 <w:webHidden/>
               </w:rPr>
-              <w:instrText xml:space="preserve"> PAGEREF _Toc239020416 \h </w:instrText>
+              <w:instrText xml:space="preserve"> PAGEREF _Toc239025983 \h </w:instrText>
             </w:r>
             <w:r>
               <w:rPr>
@@ -1382,7 +1454,7 @@
               <w:lang w:eastAsia="es-MX"/>
             </w:rPr>
           </w:pPr>
-          <w:hyperlink w:anchor="_Toc239020417" w:history="1">
+          <w:hyperlink w:anchor="_Toc239025984" w:history="1">
             <w:r>
               <w:rPr>
                 <w:rStyle w:val="Hipervnculo"/>
@@ -1409,7 +1481,7 @@
                 <w:noProof/>
                 <w:webHidden/>
               </w:rPr>
-              <w:instrText xml:space="preserve"> PAGEREF _Toc239020417 \h </w:instrText>
+              <w:instrText xml:space="preserve"> PAGEREF _Toc239025984 \h </w:instrText>
             </w:r>
             <w:r>
               <w:rPr>
@@ -1429,7 +1501,7 @@
                 <w:noProof/>
                 <w:webHidden/>
               </w:rPr>
-              <w:t>10</w:t>
+              <w:t>11</w:t>
             </w:r>
             <w:r>
               <w:rPr>
@@ -1454,7 +1526,7 @@
               <w:lang w:eastAsia="es-MX"/>
             </w:rPr>
           </w:pPr>
-          <w:hyperlink w:anchor="_Toc239020418" w:history="1">
+          <w:hyperlink w:anchor="_Toc239025985" w:history="1">
             <w:r>
               <w:rPr>
                 <w:rStyle w:val="Hipervnculo"/>
@@ -1481,7 +1553,7 @@
                 <w:noProof/>
                 <w:webHidden/>
               </w:rPr>
-              <w:instrText xml:space="preserve"> PAGEREF _Toc239020418 \h </w:instrText>
+              <w:instrText xml:space="preserve"> PAGEREF _Toc239025985 \h </w:instrText>
             </w:r>
             <w:r>
               <w:rPr>
@@ -1540,7 +1612,7 @@
       <w:pPr>
         <w:pStyle w:val="Ttulo1"/>
       </w:pPr>
-      <w:bookmarkStart w:id="0" w:name="_Toc239020404"/>
+      <w:bookmarkStart w:id="0" w:name="_Toc239025970"/>
       <w:r>
         <w:lastRenderedPageBreak/>
         <w:t>Objetivo de la actividad</w:t>
@@ -1568,7 +1640,7 @@
       <w:pPr>
         <w:pStyle w:val="Ttulo1"/>
       </w:pPr>
-      <w:bookmarkStart w:id="1" w:name="_Toc239020405"/>
+      <w:bookmarkStart w:id="1" w:name="_Toc239025971"/>
       <w:r>
         <w:t>Descripción del escenario</w:t>
       </w:r>
@@ -1670,7 +1742,7 @@
       <w:pPr>
         <w:pStyle w:val="Ttulo1"/>
       </w:pPr>
-      <w:bookmarkStart w:id="2" w:name="_Toc239020406"/>
+      <w:bookmarkStart w:id="2" w:name="_Toc239025972"/>
       <w:r>
         <w:t>Configuración del laboratorio</w:t>
       </w:r>
@@ -1817,7 +1889,7 @@
       <w:pPr>
         <w:pStyle w:val="Ttulo1"/>
       </w:pPr>
-      <w:bookmarkStart w:id="3" w:name="_Toc239020407"/>
+      <w:bookmarkStart w:id="3" w:name="_Toc239025973"/>
       <w:r>
         <w:lastRenderedPageBreak/>
         <w:t>Evidencias y descripción del funcionamiento</w:t>
@@ -1828,7 +1900,7 @@
       <w:pPr>
         <w:pStyle w:val="Ttulo2"/>
       </w:pPr>
-      <w:bookmarkStart w:id="4" w:name="_Toc239020408"/>
+      <w:bookmarkStart w:id="4" w:name="_Toc239025974"/>
       <w:r>
         <w:t>1-</w:t>
       </w:r>
@@ -1938,7 +2010,7 @@
       <w:pPr>
         <w:pStyle w:val="Ttulo2"/>
       </w:pPr>
-      <w:bookmarkStart w:id="5" w:name="_Toc239020409"/>
+      <w:bookmarkStart w:id="5" w:name="_Toc239025975"/>
       <w:r>
         <w:t>2-</w:t>
       </w:r>
@@ -2153,7 +2225,7 @@
       <w:pPr>
         <w:pStyle w:val="Ttulo2"/>
       </w:pPr>
-      <w:bookmarkStart w:id="6" w:name="_Toc239020410"/>
+      <w:bookmarkStart w:id="6" w:name="_Toc239025976"/>
       <w:r>
         <w:t>3- Configuración del ataque en SET</w:t>
       </w:r>
@@ -2467,10 +2539,6 @@
     <w:p>
       <w:pPr>
         <w:pStyle w:val="Descripcin"/>
-        <w:rPr>
-          <w:rFonts w:ascii="Arial" w:hAnsi="Arial" w:cs="Arial"/>
-          <w:lang w:val="en-US"/>
-        </w:rPr>
       </w:pPr>
       <w:r>
         <w:t xml:space="preserve">Ilustración </w:t>
@@ -2499,6 +2567,65 @@
     </w:p>
     <w:p>
       <w:pPr>
+        <w:pStyle w:val="Ttulo3"/>
+      </w:pPr>
+      <w:bookmarkStart w:id="7" w:name="_Toc239025977"/>
+      <w:r>
+        <w:t>¿Qué es un Credential Harvester y cuál es su función dentro de una campaña de phishing?</w:t>
+      </w:r>
+      <w:bookmarkEnd w:id="7"/>
+    </w:p>
+    <w:p>
+      <w:pPr>
+        <w:rPr>
+          <w:rFonts w:ascii="Arial" w:hAnsi="Arial" w:cs="Arial"/>
+          <w:sz w:val="24"/>
+          <w:szCs w:val="24"/>
+        </w:rPr>
+      </w:pPr>
+      <w:r>
+        <w:rPr>
+          <w:rFonts w:ascii="Arial" w:hAnsi="Arial" w:cs="Arial"/>
+          <w:sz w:val="24"/>
+          <w:szCs w:val="24"/>
+        </w:rPr>
+        <w:t>Un Credential Harvester es una herramienta o técnica de ciberseguridad diseñada para crear servidores web falsos o replicar interfaces legítimas de autenticación con el objetivo de capturar y almacenar nombres de usuario, contraseñas y otros datos sensibles introducidos por las víctimas</w:t>
+      </w:r>
+      <w:r>
+        <w:rPr>
+          <w:rFonts w:ascii="Arial" w:hAnsi="Arial" w:cs="Arial"/>
+          <w:sz w:val="24"/>
+          <w:szCs w:val="24"/>
+        </w:rPr>
+        <w:t xml:space="preserve"> y actúa </w:t>
+      </w:r>
+      <w:r>
+        <w:rPr>
+          <w:rFonts w:ascii="Arial" w:hAnsi="Arial" w:cs="Arial"/>
+          <w:sz w:val="24"/>
+          <w:szCs w:val="24"/>
+        </w:rPr>
+        <w:t>como el punto de captura central dentro de la campaña. Mientras que el correo o mensaje engañoso actúa como el señuelo para atraer a la víctima, el Credential Harvester proporciona la infraestructura fraudulenta que intercepta las credenciales en texto plano cuando el usuario intenta iniciar sesión, registrándolas en una base de datos o archivo de log local para que el atacante pueda utilizarlas posteriormente en accesos no autorizados o ataques de movimiento lateral.</w:t>
+      </w:r>
+      <w:r>
+        <w:rPr>
+          <w:rFonts w:ascii="Arial" w:hAnsi="Arial" w:cs="Arial"/>
+          <w:sz w:val="24"/>
+          <w:szCs w:val="24"/>
+        </w:rPr>
+        <w:t xml:space="preserve"> </w:t>
+      </w:r>
+      <w:r>
+        <w:rPr>
+          <w:rFonts w:ascii="Arial" w:hAnsi="Arial" w:cs="Arial"/>
+          <w:sz w:val="24"/>
+          <w:szCs w:val="24"/>
+        </w:rPr>
+        <w:t>(Zhou, 2025)</w:t>
+      </w:r>
+    </w:p>
+    <w:p>
+      <w:pPr>
         <w:rPr>
           <w:rFonts w:ascii="Arial" w:hAnsi="Arial" w:cs="Arial"/>
           <w:sz w:val="24"/>
@@ -2543,26 +2670,32 @@
           <w:sz w:val="24"/>
           <w:szCs w:val="24"/>
         </w:rPr>
-        <w:t xml:space="preserve"> dan, nosotros </w:t>
-      </w:r>
-      <w:r>
-        <w:rPr>
-          <w:rFonts w:ascii="Arial" w:hAnsi="Arial" w:cs="Arial"/>
-          <w:sz w:val="24"/>
-          <w:szCs w:val="24"/>
-        </w:rPr>
-        <w:t>ocuparemos Credential Harvester ya que clona un sitio web que contenga campos de nombre de usuario y contraseña, justo como el formulario que realizamos en index.html.</w:t>
-      </w:r>
-    </w:p>
-    <w:p>
-      <w:pPr>
-        <w:keepNext/>
-      </w:pPr>
+        <w:t xml:space="preserve"> dan, </w:t>
+      </w:r>
+      <w:r>
+        <w:rPr>
+          <w:rFonts w:ascii="Arial" w:hAnsi="Arial" w:cs="Arial"/>
+          <w:sz w:val="24"/>
+          <w:szCs w:val="24"/>
+        </w:rPr>
+        <w:t>se seleccionó el módulo Credential Harvester Attack Method, ya que nos permite alojar y servir nuestro portal personalizado (index.html) para interceptar los datos ingresados en el formulari</w:t>
+      </w:r>
+      <w:r>
+        <w:rPr>
+          <w:rFonts w:ascii="Arial" w:hAnsi="Arial" w:cs="Arial"/>
+          <w:sz w:val="24"/>
+          <w:szCs w:val="24"/>
+        </w:rPr>
+        <w:t>o.</w:t>
+      </w:r>
+    </w:p>
+    <w:p>
       <w:r>
         <w:rPr>
           <w:rFonts w:ascii="Arial" w:hAnsi="Arial" w:cs="Arial"/>
           <w:noProof/>
         </w:rPr>
+        <w:lastRenderedPageBreak/>
         <w:drawing>
           <wp:inline distT="0" distB="0" distL="0" distR="0" wp14:anchorId="6BE2F764" wp14:editId="79A16685">
             <wp:extent cx="4859550" cy="4391247"/>
@@ -2665,7 +2798,6 @@
           <w:sz w:val="24"/>
           <w:szCs w:val="24"/>
         </w:rPr>
-        <w:lastRenderedPageBreak/>
         <w:t xml:space="preserve">En el </w:t>
       </w:r>
       <w:r>
@@ -2827,6 +2959,7 @@
           <w:sz w:val="24"/>
           <w:szCs w:val="24"/>
         </w:rPr>
+        <w:lastRenderedPageBreak/>
         <w:t>Pedirá la ruta del directorio en donde guardaste la página en mi caso fue /home/Kali/actividad4/</w:t>
       </w:r>
       <w:r>
@@ -2997,7 +3130,6 @@
           <w:sz w:val="24"/>
           <w:szCs w:val="24"/>
         </w:rPr>
-        <w:lastRenderedPageBreak/>
         <w:t xml:space="preserve">Para ver nuestro sitio en el servidor, basta con introducir http:// IP local </w:t>
       </w:r>
     </w:p>
@@ -3090,13 +3222,27 @@
     </w:p>
     <w:p>
       <w:pPr>
+        <w:rPr>
+          <w:rFonts w:asciiTheme="majorHAnsi" w:eastAsiaTheme="majorEastAsia" w:hAnsiTheme="majorHAnsi" w:cstheme="majorBidi"/>
+          <w:color w:val="B3186D" w:themeColor="accent1" w:themeShade="BF"/>
+          <w:sz w:val="40"/>
+          <w:szCs w:val="40"/>
+        </w:rPr>
+      </w:pPr>
+      <w:r>
+        <w:br w:type="page"/>
+      </w:r>
+    </w:p>
+    <w:p>
+      <w:pPr>
         <w:pStyle w:val="Ttulo1"/>
       </w:pPr>
-      <w:bookmarkStart w:id="7" w:name="_Toc239020411"/>
-      <w:r>
+      <w:bookmarkStart w:id="8" w:name="_Toc239025978"/>
+      <w:r>
+        <w:lastRenderedPageBreak/>
         <w:t>Simulación de interacción de la victima</w:t>
       </w:r>
-      <w:bookmarkEnd w:id="7"/>
+      <w:bookmarkEnd w:id="8"/>
     </w:p>
     <w:p>
       <w:pPr>
@@ -3219,7 +3365,6 @@
           <w:rFonts w:ascii="Arial" w:hAnsi="Arial" w:cs="Arial"/>
           <w:noProof/>
         </w:rPr>
-        <w:lastRenderedPageBreak/>
         <w:drawing>
           <wp:inline distT="0" distB="0" distL="0" distR="0" wp14:anchorId="08549577" wp14:editId="5F5C5F5F">
             <wp:extent cx="4401879" cy="1766952"/>
@@ -3300,13 +3445,27 @@
     </w:p>
     <w:p>
       <w:pPr>
+        <w:rPr>
+          <w:rFonts w:asciiTheme="majorHAnsi" w:eastAsiaTheme="majorEastAsia" w:hAnsiTheme="majorHAnsi" w:cstheme="majorBidi"/>
+          <w:color w:val="B3186D" w:themeColor="accent1" w:themeShade="BF"/>
+          <w:sz w:val="40"/>
+          <w:szCs w:val="40"/>
+        </w:rPr>
+      </w:pPr>
+      <w:r>
+        <w:br w:type="page"/>
+      </w:r>
+    </w:p>
+    <w:p>
+      <w:pPr>
         <w:pStyle w:val="Ttulo1"/>
       </w:pPr>
-      <w:bookmarkStart w:id="8" w:name="_Toc239020412"/>
-      <w:r>
+      <w:bookmarkStart w:id="9" w:name="_Toc239025979"/>
+      <w:r>
+        <w:lastRenderedPageBreak/>
         <w:t>Verificación y conservación de logs</w:t>
       </w:r>
-      <w:bookmarkEnd w:id="8"/>
+      <w:bookmarkEnd w:id="9"/>
     </w:p>
     <w:p>
       <w:pPr>
@@ -3415,12 +3574,11 @@
       <w:pPr>
         <w:pStyle w:val="Ttulo1"/>
       </w:pPr>
-      <w:bookmarkStart w:id="9" w:name="_Toc239020413"/>
-      <w:r>
-        <w:lastRenderedPageBreak/>
+      <w:bookmarkStart w:id="10" w:name="_Toc239025980"/>
+      <w:r>
         <w:t>Explicación del flujo de captura de información.</w:t>
       </w:r>
-      <w:bookmarkEnd w:id="9"/>
+      <w:bookmarkEnd w:id="10"/>
     </w:p>
     <w:p>
       <w:pPr>
@@ -3491,6 +3649,7 @@
           <w:sz w:val="24"/>
           <w:szCs w:val="24"/>
         </w:rPr>
+        <w:lastRenderedPageBreak/>
         <w:t xml:space="preserve">La diferencia entre la captura de credenciales y vulneración de una contraseña es que la captura de credenciales es la intercepción del canal de transmisión de datos en texto plano mediante un servidor de suplantación. No vulnera la contraseña en la base de datos ni descifra hashes y en la vulneración de contraseñas se </w:t>
       </w:r>
       <w:r>
@@ -3506,21 +3665,21 @@
       <w:pPr>
         <w:pStyle w:val="Ttulo1"/>
       </w:pPr>
-      <w:bookmarkStart w:id="10" w:name="_Toc239020414"/>
+      <w:bookmarkStart w:id="11" w:name="_Toc239025981"/>
       <w:r>
         <w:t>Controles de seguridad propuestos</w:t>
       </w:r>
-      <w:bookmarkEnd w:id="10"/>
+      <w:bookmarkEnd w:id="11"/>
     </w:p>
     <w:p>
       <w:pPr>
         <w:pStyle w:val="Ttulo2"/>
       </w:pPr>
-      <w:bookmarkStart w:id="11" w:name="_Toc239020415"/>
+      <w:bookmarkStart w:id="12" w:name="_Toc239025982"/>
       <w:r>
         <w:t>Indicadores relevantes de phishing</w:t>
       </w:r>
-      <w:bookmarkEnd w:id="11"/>
+      <w:bookmarkEnd w:id="12"/>
     </w:p>
     <w:p>
       <w:pPr>
@@ -3644,12 +3803,11 @@
       <w:pPr>
         <w:pStyle w:val="Ttulo2"/>
       </w:pPr>
-      <w:bookmarkStart w:id="12" w:name="_Toc239020416"/>
-      <w:r>
-        <w:lastRenderedPageBreak/>
+      <w:bookmarkStart w:id="13" w:name="_Toc239025983"/>
+      <w:r>
         <w:t>Controles de seguridad</w:t>
       </w:r>
-      <w:bookmarkEnd w:id="12"/>
+      <w:bookmarkEnd w:id="13"/>
     </w:p>
     <w:p>
       <w:pPr>
@@ -3845,11 +4003,12 @@
       <w:pPr>
         <w:pStyle w:val="Ttulo1"/>
       </w:pPr>
-      <w:bookmarkStart w:id="13" w:name="_Toc239020417"/>
-      <w:r>
+      <w:bookmarkStart w:id="14" w:name="_Toc239025984"/>
+      <w:r>
+        <w:lastRenderedPageBreak/>
         <w:t>Conclusión</w:t>
       </w:r>
-      <w:bookmarkEnd w:id="13"/>
+      <w:bookmarkEnd w:id="14"/>
     </w:p>
     <w:p>
       <w:pPr>
@@ -3895,27 +4054,16 @@
     </w:p>
     <w:p>
       <w:pPr>
-        <w:rPr>
-          <w:rFonts w:asciiTheme="majorHAnsi" w:eastAsiaTheme="majorEastAsia" w:hAnsiTheme="majorHAnsi" w:cstheme="majorBidi"/>
-          <w:color w:val="B3186D" w:themeColor="accent1" w:themeShade="BF"/>
-          <w:sz w:val="40"/>
-          <w:szCs w:val="40"/>
-        </w:rPr>
-      </w:pPr>
-      <w:r>
-        <w:br w:type="page"/>
-      </w:r>
-    </w:p>
-    <w:p>
-      <w:pPr>
         <w:pStyle w:val="Ttulo1"/>
-      </w:pPr>
-      <w:bookmarkStart w:id="14" w:name="_Toc239020418"/>
-      <w:r>
-        <w:lastRenderedPageBreak/>
+        <w:rPr>
+          <w:u w:val="single"/>
+        </w:rPr>
+      </w:pPr>
+      <w:bookmarkStart w:id="15" w:name="_Toc239025985"/>
+      <w:r>
         <w:t>Referencias</w:t>
       </w:r>
-      <w:bookmarkEnd w:id="14"/>
+      <w:bookmarkEnd w:id="15"/>
     </w:p>
     <w:p>
       <w:pPr>
@@ -4023,15 +4171,59 @@
       </w:hyperlink>
     </w:p>
     <w:p>
-      <w:pPr>
+      <w:r>
         <w:rPr>
           <w:lang w:val="en-US"/>
         </w:rPr>
-      </w:pPr>
+        <w:t>Zhou, L. (2025, March 29). </w:t>
+      </w:r>
       <w:r>
         <w:rPr>
           <w:i/>
           <w:iCs/>
+          <w:lang w:val="en-US"/>
+        </w:rPr>
+        <w:t>What is Credential Harvesting? Detection &amp; Prevention Techniques</w:t>
+      </w:r>
+      <w:r>
+        <w:rPr>
+          <w:lang w:val="en-US"/>
+        </w:rPr>
+        <w:t xml:space="preserve">. </w:t>
+      </w:r>
+      <w:proofErr w:type="spellStart"/>
+      <w:r>
+        <w:rPr>
+          <w:lang w:val="en-US"/>
+        </w:rPr>
+        <w:t>VMRay</w:t>
+      </w:r>
+      <w:proofErr w:type="spellEnd"/>
+      <w:r>
+        <w:rPr>
+          <w:lang w:val="en-US"/>
+        </w:rPr>
+        <w:t xml:space="preserve">. </w:t>
+      </w:r>
+      <w:hyperlink r:id="rId27" w:history="1">
+        <w:r>
+          <w:rPr>
+            <w:rStyle w:val="Hipervnculo"/>
+          </w:rPr>
+          <w:t>https://www.vmray.com/credential-harvesting/</w:t>
+        </w:r>
+      </w:hyperlink>
+    </w:p>
+    <w:p>
+      <w:pPr>
+        <w:rPr>
+          <w:lang w:val="en-US"/>
+        </w:rPr>
+      </w:pPr>
+      <w:r>
+        <w:rPr>
+          <w:i/>
+          <w:iCs/>
         </w:rPr>
         <w:t>¿Qué es el phishing? | Seguridad de Microsoft</w:t>
       </w:r>
@@ -4044,7 +4236,7 @@
         </w:rPr>
         <w:t xml:space="preserve">(2026). Microsoft.Com. </w:t>
       </w:r>
-      <w:hyperlink r:id="rId27" w:history="1">
+      <w:hyperlink r:id="rId28" w:history="1">
         <w:r>
           <w:rPr>
             <w:rStyle w:val="Hipervnculo"/>
@@ -4064,6 +4256,7 @@
     <w:p>
       <w:pPr>
         <w:rPr>
+          <w:u w:val="single"/>
           <w:lang w:val="en-US"/>
         </w:rPr>
       </w:pPr>
@@ -5437,7 +5630,6 @@
     <w:next w:val="Normal"/>
     <w:link w:val="Ttulo3Car"/>
     <w:uiPriority w:val="9"/>
-    <w:semiHidden/>
     <w:unhideWhenUsed/>
     <w:qFormat/>
     <w:rsid w:val="004A3FCB"/>
@@ -5643,7 +5835,6 @@
     <w:basedOn w:val="Fuentedeprrafopredeter"/>
     <w:link w:val="Ttulo3"/>
     <w:uiPriority w:val="9"/>
-    <w:semiHidden/>
     <w:rsid w:val="004A3FCB"/>
     <w:rPr>
       <w:rFonts w:eastAsiaTheme="majorEastAsia" w:cstheme="majorBidi"/>
@@ -6016,6 +6207,30 @@
       <w:sz w:val="18"/>
       <w:szCs w:val="18"/>
     </w:rPr>
+  </w:style>
+  <w:style w:type="paragraph" w:styleId="TDC3">
+    <w:name w:val="toc 3"/>
+    <w:basedOn w:val="Normal"/>
+    <w:next w:val="Normal"/>
+    <w:autoRedefine/>
+    <w:uiPriority w:val="39"/>
+    <w:unhideWhenUsed/>
+    <w:rsid w:val="001C6522"/>
+    <w:pPr>
+      <w:spacing w:after="100"/>
+      <w:ind w:left="440"/>
+    </w:pPr>
+  </w:style>
+  <w:style w:type="paragraph" w:styleId="Tabladeilustraciones">
+    <w:name w:val="table of figures"/>
+    <w:basedOn w:val="Normal"/>
+    <w:next w:val="Normal"/>
+    <w:uiPriority w:val="99"/>
+    <w:unhideWhenUsed/>
+    <w:rsid w:val="001C6522"/>
+    <w:pPr>
+      <w:spacing w:after="0"/>
+    </w:pPr>
   </w:style>
 </w:styles>
 </file>

</xml_diff>